<commit_message>
Paparan: cantumkan Bidang Fokus 3 (Tata Kelola Kolaboratif dan Pelayanan Publik)
Slide 1 memuat kategori dan bidang fokus; slide 12 diberi pita bidang fokus
beserta empat subfokus yang dijawab, sesuai proposal; naskah pembuka dan
slide 12 disesuaikan.

Co-Authored-By: Claude Opus 5.5 <noreply@anthropic.com>
Claude-Session: https://claude.ai/code/session_01TchDZWsQsgeuq52sKmozd1
</commit_message>
<xml_diff>
--- a/docs/lomba/kaltara/Naskah-Paparan-10-Menit.docx
+++ b/docs/lomba/kaltara/Naskah-Paparan-10-Menit.docx
@@ -934,7 +934,7 @@
               <w:rPr>
                 <w:sz w:val="21"/>
               </w:rPr>
-              <w:t>Kompatibilitas</w:t>
+              <w:t>Kompatibilitas dan bidang fokus</w:t>
             </w:r>
           </w:p>
         </w:tc>
@@ -948,7 +948,7 @@
               <w:rPr>
                 <w:sz w:val="21"/>
               </w:rPr>
-              <w:t>Inovasi ini selaras dengan Undang-Undang Pelayanan Publik dan Keprotok…</w:t>
+              <w:t>Inovasi ini menjawab Bidang Fokus 3 pada pedoman, Tata Kelola Kolabora…</w:t>
             </w:r>
           </w:p>
         </w:tc>
@@ -1061,7 +1061,7 @@
           <w:color w:val="A8862E"/>
           <w:sz w:val="20"/>
         </w:rPr>
-        <w:t>0:00–0:25 · ±44 kata</w:t>
+        <w:t>0:00–0:25 · ±54 kata</w:t>
       </w:r>
     </w:p>
     <w:p>
@@ -1083,7 +1083,7 @@
         <w:rPr>
           <w:sz w:val="28"/>
         </w:rPr>
-        <w:t>Izin kami sampaikan Prokopim Hibot, satu alur digital terverifikasi untuk agenda Pimpinan Daerah, dari Bagian Protokol dan Komunikasi Pimpinan, Sekretariat Daerah Kota Tarakan. Kami mengikuti kategori Inovasi Terapan, ASN Pemerintah Kabupaten/Kota.</w:t>
+        <w:t>Izin kami sampaikan Prokopim Hibot, satu alur digital terverifikasi untuk agenda Pimpinan Daerah, dari Bagian Protokol dan Komunikasi Pimpinan, Sekretariat Daerah Kota Tarakan. Kami mengikuti kategori Inovasi Terapan, ASN Pemerintah Kabupaten/Kota, pada Bidang Fokus 3: Tata Kelola Kolaboratif dan Pelayanan Publik.</w:t>
       </w:r>
     </w:p>
     <w:tbl>
@@ -2131,7 +2131,7 @@
           <w:color w:val="1E3A6E"/>
           <w:sz w:val="26"/>
         </w:rPr>
-        <w:t>SLIDE 12 · KOMPATIBILITAS</w:t>
+        <w:t>SLIDE 12 · KOMPATIBILITAS DAN BIDANG FOKUS</w:t>
       </w:r>
     </w:p>
     <w:p>
@@ -2146,7 +2146,7 @@
           <w:color w:val="A8862E"/>
           <w:sz w:val="20"/>
         </w:rPr>
-        <w:t>8:25–8:50 · ±40 kata</w:t>
+        <w:t>8:25–8:50 · ±50 kata</w:t>
       </w:r>
     </w:p>
     <w:p>
@@ -2157,13 +2157,19 @@
         <w:rPr>
           <w:sz w:val="28"/>
         </w:rPr>
-        <w:t>Inovasi ini selaras dengan Undang-Undang Pelayanan Publik dan Keprotokolan, Peraturan Pemerintah tentang Inovasi Daerah, dan SPBE, serta mendukung Misi 3 RPJMD Kalimantan Utara dan Misi 4 Kota Tarakan.</w:t>
+        <w:t>Inovasi ini menjawab Bidang Fokus 3 pada pedoman, Tata Kelola Kolaboratif dan Pelayanan Publik: digitalisasi pelayanan, penyederhanaan proses bisnis, integrasi data, serta transparansi dan akuntabilitas.</w:t>
       </w:r>
     </w:p>
     <w:p>
       <w:pPr>
         <w:spacing w:after="140" w:line="300" w:lineRule="auto"/>
       </w:pPr>
+      <w:r>
+        <w:rPr>
+          <w:sz w:val="28"/>
+        </w:rPr>
+        <w:t xml:space="preserve">Juga selaras dengan Misi 3 RPJMD Kalimantan Utara dan Misi 4 Kota Tarakan. </w:t>
+      </w:r>
       <w:r>
         <w:rPr>
           <w:i/>
@@ -2202,7 +2208,7 @@
                 <w:i/>
                 <w:sz w:val="21"/>
               </w:rPr>
-              <w:t>Cukup sebut garis besar; nomor peraturan sudah tertulis di slide.</w:t>
+              <w:t>Tunjuk pita Bidang Fokus di atas. Nomor peraturan cukup tertulis di slide, tidak perlu dibacakan.</w:t>
             </w:r>
           </w:p>
         </w:tc>

</xml_diff>